<commit_message>
Adapt submission package to journal guidelines (declarations on title page, Fig. 1 redesign, ESM as PDF)
Co-Authored-By: Claude Sonnet 5.5 <noreply@anthropic.com>
Claude-Session: https://claude.ai/code/session_019tVoF28ak8howjL2gUeBpa
</commit_message>
<xml_diff>
--- a/submission_POR/1_Manuscript_anonymized.docx
+++ b/submission_POR/1_Manuscript_anonymized.docx
@@ -100,7 +100,7 @@
           <w:sz w:val="24"/>
           <w:szCs w:val="24"/>
         </w:rPr>
-        <w:t xml:space="preserve">Escalating demands for transparency, fiscal discipline and value for money have placed financial control at the center of public governance debates (Chan, 2003; OECD, 2020; Robinson, 2013). Public institutions must not only comply with statutory and budgetary requirements but also protect state resources against fraud, waste and mismanagement (COSO, 2013; Doyle &amp; McVay, 2007). Internal control provides reasonable assurance on these goals. COSO (2013) describes it through five components. Among them, control activities such as authorizations, reconciliations, supervisory reviews and segregation of duties directly govern transaction execution (Arens et al., 2014; Romney &amp; Steinbart, 2017). Strategic financial management, by contrast, covers planning, performance-oriented budgeting and fiscal oversight that connect resources to administrative goals (Atrill, 2006; Robinson, 2013).</w:t>
+        <w:t xml:space="preserve">Escalating demands for transparency, fiscal discipline and value for money have placed financial control at the center of public governance debates (Chan, 2003; OECD, 2020; Robinson, 2013). Public institutions must not only comply with statutory and budgetary requirements but also protect state resources against fraud, waste and mismanagement (Committee of Sponsoring Organizations [COSO], 2013; Doyle &amp; McVay, 2007). Internal control provides reasonable assurance on these goals. COSO (2013) describes it through five components. Among them, control activities such as authorizations, reconciliations, supervisory reviews and segregation of duties directly govern transaction execution (Arens et al., 2014; Romney &amp; Steinbart, 2017). Strategic financial management, by contrast, covers planning, performance-oriented budgeting and fiscal oversight that connect resources to administrative goals (Atrill, 2006; Robinson, 2013).</w:t>
       </w:r>
     </w:p>
     <w:p>
@@ -631,7 +631,7 @@
           <w:sz w:val="24"/>
           <w:szCs w:val="24"/>
         </w:rPr>
-        <w:t xml:space="preserve">Normality was assessed with Kolmogorov–Smirnov (Lilliefors), Shapiro–Wilk and Mardia (1970) tests. Following the two-step approach of Anderson and Gerbing (1988), a six-factor confirmatory factor analysis (CFA) was estimated first. Reliability was judged with Cronbach’s alpha and composite reliability (CR ≥ 0.70), convergent validity with the average variance extracted (AVE ≥ 0.50, acceptable below this value when CR exceeds 0.60; Fornell &amp; Larcker, 1981), and discriminant validity with the Fornell–Larcker criterion and the heterotrait–monotrait ratio (HTMT &lt; 0.85; Henseler et al., 2015). Common method bias was examined with Harman’s test and CFA models with an unmeasured latent method factor (Podsakoff et al., 2003). The structural model was then estimated by maximum likelihood. Fit was judged with the combined criteria of Hu and Bentler (1999): CFI and TLI ≥ 0.95, RMSEA ≤ 0.06 and SRMR ≤ 0.08. Paths were tested with 2,000 bootstrap resamples (Efron &amp; Tibshirani, 1993), including tests of the differences between the effects of the two predictors. Covariance-based modeling was chosen because the hypotheses are tested in a reflective model that requires confirmatory evidence of validity and global fit tests (Kline, 2016). Robustness was examined with competing models, DWLS and polychoric-based estimates, outlier removal, correlated residuals, a retained method factor and demographic controls.</w:t>
+        <w:t xml:space="preserve">Normality was assessed with Kolmogorov–Smirnov (Lilliefors), Shapiro–Wilk and Mardia (1970) tests. Following the two-step approach of Anderson and Gerbing (1988), a six-factor confirmatory factor analysis (CFA) was estimated first. Reliability was judged with Cronbach’s alpha and composite reliability (CR ≥ 0.70), convergent validity with the average variance extracted (AVE ≥ 0.50, acceptable below this value when CR exceeds 0.60; Fornell &amp; Larcker, 1981), and discriminant validity with the Fornell–Larcker criterion and the heterotrait–monotrait ratio (HTMT &lt; 0.85; Henseler et al., 2015). Common method bias was examined with Harman’s test and CFA models with an unmeasured latent method factor (Podsakoff et al., 2003). The structural model was then estimated by maximum likelihood (ML). Fit was judged with the combined criteria of Hu and Bentler (1999): comparative fit index (CFI) and Tucker–Lewis index (TLI) ≥ 0.95, root mean square error of approximation (RMSEA) ≤ 0.06 and standardized root mean square residual (SRMR) ≤ 0.08. Paths were tested with 2,000 bootstrap resamples (Efron &amp; Tibshirani, 1993), including tests of the differences between the effects of the two predictors. Covariance-based modeling was chosen because the hypotheses are tested in a reflective model that requires confirmatory evidence of validity and global fit tests (Kline, 2016). Robustness was examined with competing models, diagonally weighted least squares (DWLS) and polychoric-based estimates, outlier removal, correlated residuals, a retained method factor and demographic controls.</w:t>
       </w:r>
     </w:p>
     <w:p>
@@ -693,10 +693,20 @@
       <w:r>
         <w:rPr>
           <w:rFonts w:ascii="Times New Roman" w:hAnsi="Times New Roman" w:cs="Times New Roman" w:eastAsia="Times New Roman"/>
+          <w:b/>
+          <w:bCs/>
           <w:sz w:val="20"/>
           <w:szCs w:val="20"/>
         </w:rPr>
-        <w:t xml:space="preserve">Table 1  Descriptive statistics and correlations of the constructs (N = 187)</w:t>
+        <w:t xml:space="preserve">Table 1</w:t>
+      </w:r>
+      <w:r>
+        <w:rPr>
+          <w:rFonts w:ascii="Times New Roman" w:hAnsi="Times New Roman" w:cs="Times New Roman" w:eastAsia="Times New Roman"/>
+          <w:sz w:val="20"/>
+          <w:szCs w:val="20"/>
+        </w:rPr>
+        <w:t xml:space="preserve">  Descriptive statistics and correlations of the constructs (N = 187)</w:t>
       </w:r>
     </w:p>
     <w:tbl>
@@ -2293,10 +2303,20 @@
       <w:r>
         <w:rPr>
           <w:rFonts w:ascii="Times New Roman" w:hAnsi="Times New Roman" w:cs="Times New Roman" w:eastAsia="Times New Roman"/>
+          <w:b/>
+          <w:bCs/>
           <w:sz w:val="20"/>
           <w:szCs w:val="20"/>
         </w:rPr>
-        <w:t xml:space="preserve">Table 2  Reliability, convergent and discriminant validity</w:t>
+        <w:t xml:space="preserve">Table 2</w:t>
+      </w:r>
+      <w:r>
+        <w:rPr>
+          <w:rFonts w:ascii="Times New Roman" w:hAnsi="Times New Roman" w:cs="Times New Roman" w:eastAsia="Times New Roman"/>
+          <w:sz w:val="20"/>
+          <w:szCs w:val="20"/>
+        </w:rPr>
+        <w:t xml:space="preserve">  Reliability, convergent and discriminant validity</w:t>
       </w:r>
     </w:p>
     <w:tbl>
@@ -3530,7 +3550,7 @@
           <w:sz w:val="18"/>
           <w:szCs w:val="18"/>
         </w:rPr>
-        <w:t xml:space="preserve">Note. CR = composite reliability; AVE = average variance extracted; MSV = maximum shared variance; HTMT = heterotrait–monotrait ratio (highest value with any other construct). The square root of AVE exceeds all latent correlations for every construct (Online Resource 1, Table S4).</w:t>
+        <w:t xml:space="preserve">Note. α = Cronbach’s alpha; CR = composite reliability; AVE = average variance extracted; MSV = maximum shared variance; HTMT = heterotrait–monotrait ratio (highest value with any other construct). The square root of AVE exceeds all latent correlations for every construct (Online Resource 1, Table S4).</w:t>
       </w:r>
     </w:p>
     <w:p>
@@ -3577,7 +3597,7 @@
           <w:sz w:val="24"/>
           <w:szCs w:val="24"/>
         </w:rPr>
-        <w:t xml:space="preserve">The structural model fitted the data well (Table 3). Fit did not deteriorate significantly relative to the saturated model (Δχ² = 7.46, Δdf = 6, p = 0.280), and both predictors were needed: removing the paths of financial management or those of control activities worsened fit significantly (Δχ² = 56.7 and 58.0, Δdf = 4, p &lt; 0.001). The NFI (0.859) and GFI (0.839) were below 0.90, which is common in models with many indicators and a modest sample (Kline, 2016). The two predictors were moderately correlated (r = 0.50, VIF = 1.24).</w:t>
+        <w:t xml:space="preserve">The structural model fitted the data well (Table 3). Fit did not deteriorate significantly relative to the saturated model (Δχ² = 7.46, Δdf = 6, p = 0.280), and both predictors were needed: removing the paths of financial management or those of control activities worsened fit significantly (Δχ² = 56.7 and 58.0, Δdf = 4, p &lt; 0.001). The NFI (0.859) and GFI (0.839) were below 0.90, which is common in models with many indicators and a modest sample (Kline, 2016). The two predictors were moderately correlated (r = 0.50, variance inflation factor = 1.24).</w:t>
       </w:r>
     </w:p>
     <w:p>
@@ -3589,10 +3609,20 @@
       <w:r>
         <w:rPr>
           <w:rFonts w:ascii="Times New Roman" w:hAnsi="Times New Roman" w:cs="Times New Roman" w:eastAsia="Times New Roman"/>
+          <w:b/>
+          <w:bCs/>
           <w:sz w:val="20"/>
           <w:szCs w:val="20"/>
         </w:rPr>
-        <w:t xml:space="preserve">Table 3  Model fit and comparison of competing models</w:t>
+        <w:t xml:space="preserve">Table 3</w:t>
+      </w:r>
+      <w:r>
+        <w:rPr>
+          <w:rFonts w:ascii="Times New Roman" w:hAnsi="Times New Roman" w:cs="Times New Roman" w:eastAsia="Times New Roman"/>
+          <w:sz w:val="20"/>
+          <w:szCs w:val="20"/>
+        </w:rPr>
+        <w:t xml:space="preserve">  Model fit and comparison of competing models</w:t>
       </w:r>
     </w:p>
     <w:tbl>
@@ -5118,7 +5148,7 @@
           <w:sz w:val="18"/>
           <w:szCs w:val="18"/>
         </w:rPr>
-        <w:t xml:space="preserve">Note. Δχ² for the competing models is relative to the proposed model. AIC and BIC are computed from χ², and only differences between models are meaningful. NFI = 0.859 and GFI = 0.839 for the proposed model. *** p &lt; 0.001.</w:t>
+        <w:t xml:space="preserve">Note. df = degrees of freedom; Δχ² for the competing models is relative to the proposed model. AIC = Akaike information criterion and BIC = Bayesian information criterion, computed from χ²; only differences between models are meaningful. NFI = 0.859 and GFI = 0.839 for the proposed model. *** p &lt; 0.001.</w:t>
       </w:r>
     </w:p>
     <w:p>
@@ -5132,7 +5162,7 @@
           <w:sz w:val="24"/>
           <w:szCs w:val="24"/>
         </w:rPr>
-        <w:t xml:space="preserve">All eight hypotheses were supported (Table 4 and Figure 1). Control activities had positive effects on professional (β = 0.452), legal (β = 0.390), organizational (β = 0.342) and political accountability (β = 0.290). Strategic financial management had positive effects on political (β = 0.457), organizational (β = 0.394), professional (β = 0.243) and legal accountability (β = 0.207). The model explained 42.6% (political), 40.7% (organizational), 37.4% (professional) and 27.5% (legal) of the variance. Effect sizes (f²) were medium for H2, H3, H5 and H8 (0.157–0.273) and small for the other paths (0.044–0.147).</w:t>
+        <w:t xml:space="preserve">All eight hypotheses were supported (Table 4 and Fig. 1). Control activities had positive effects on professional (β = 0.452), legal (β = 0.390), organizational (β = 0.342) and political accountability (β = 0.290). Strategic financial management had positive effects on political (β = 0.457), organizational (β = 0.394), professional (β = 0.243) and legal accountability (β = 0.207). The model explained 42.6% (political), 40.7% (organizational), 37.4% (professional) and 27.5% (legal) of the variance. Effect sizes (f²) were medium for H2, H3, H5 and H8 (0.157–0.273) and small for the other paths (0.044–0.147).</w:t>
       </w:r>
     </w:p>
     <w:p>
@@ -5144,10 +5174,20 @@
       <w:r>
         <w:rPr>
           <w:rFonts w:ascii="Times New Roman" w:hAnsi="Times New Roman" w:cs="Times New Roman" w:eastAsia="Times New Roman"/>
+          <w:b/>
+          <w:bCs/>
           <w:sz w:val="20"/>
           <w:szCs w:val="20"/>
         </w:rPr>
-        <w:t xml:space="preserve">Table 4  Structural path estimates and hypothesis tests</w:t>
+        <w:t xml:space="preserve">Table 4</w:t>
+      </w:r>
+      <w:r>
+        <w:rPr>
+          <w:rFonts w:ascii="Times New Roman" w:hAnsi="Times New Roman" w:cs="Times New Roman" w:eastAsia="Times New Roman"/>
+          <w:sz w:val="20"/>
+          <w:szCs w:val="20"/>
+        </w:rPr>
+        <w:t xml:space="preserve">  Structural path estimates and hypothesis tests</w:t>
       </w:r>
     </w:p>
     <w:tbl>
@@ -7083,7 +7123,7 @@
           <w:sz w:val="18"/>
           <w:szCs w:val="18"/>
         </w:rPr>
-        <w:t xml:space="preserve">Note. b = unstandardized and β = standardized coefficient; CI = percentile bootstrap interval (2,000 resamples). R² (latent): organizational 0.407, legal 0.275, professional 0.374, political 0.426. f² thresholds: 0.02 small, 0.15 medium, 0.35 large (Cohen, 1988).</w:t>
+        <w:t xml:space="preserve">Note. b = unstandardized and β = standardized coefficient; SE = standard error; CI = percentile bootstrap interval (2,000 resamples). R² (latent): organizational 0.407, legal 0.275, professional 0.374, political 0.426. f² thresholds: 0.02 small, 0.15 medium, 0.35 large (Cohen, 1988).</w:t>
       </w:r>
     </w:p>
     <w:p>
@@ -7094,7 +7134,7 @@
       <w:r>
         <w:drawing>
           <wp:inline xmlns:a="http://schemas.openxmlformats.org/drawingml/2006/main" xmlns:pic="http://schemas.openxmlformats.org/drawingml/2006/picture">
-            <wp:extent cx="5580000" cy="4121680"/>
+            <wp:extent cx="5760000" cy="4304196"/>
             <wp:docPr id="1" name="Picture 1"/>
             <wp:cNvGraphicFramePr>
               <a:graphicFrameLocks noChangeAspect="1"/>
@@ -7103,7 +7143,7 @@
               <a:graphicData uri="http://schemas.openxmlformats.org/drawingml/2006/picture">
                 <pic:pic>
                   <pic:nvPicPr>
-                    <pic:cNvPr id="0" name="Figure1_structural_model_beta.png"/>
+                    <pic:cNvPr id="0" name="Fig1.png"/>
                     <pic:cNvPicPr/>
                   </pic:nvPicPr>
                   <pic:blipFill>
@@ -7115,7 +7155,7 @@
                   <pic:spPr>
                     <a:xfrm>
                       <a:off x="0" y="0"/>
-                      <a:ext cx="5580000" cy="4121680"/>
+                      <a:ext cx="5760000" cy="4304196"/>
                     </a:xfrm>
                     <a:prstGeom prst="rect"/>
                   </pic:spPr>
@@ -7134,10 +7174,20 @@
       <w:r>
         <w:rPr>
           <w:rFonts w:ascii="Times New Roman" w:hAnsi="Times New Roman" w:cs="Times New Roman" w:eastAsia="Times New Roman"/>
+          <w:b/>
+          <w:bCs/>
           <w:sz w:val="20"/>
           <w:szCs w:val="20"/>
         </w:rPr>
-        <w:t xml:space="preserve">Fig. 1  Estimated structural model with standardized coefficients (β), standardized loadings and R² values. *** p &lt; 0.001, ** p &lt; 0.01, * p &lt; 0.05</w:t>
+        <w:t xml:space="preserve">Fig. 1</w:t>
+      </w:r>
+      <w:r>
+        <w:rPr>
+          <w:rFonts w:ascii="Times New Roman" w:hAnsi="Times New Roman" w:cs="Times New Roman" w:eastAsia="Times New Roman"/>
+          <w:sz w:val="20"/>
+          <w:szCs w:val="20"/>
+        </w:rPr>
+        <w:t xml:space="preserve"> Estimated structural model: standardized path coefficients (β), correlation (r) between the exogenous constructs and R² of the endogenous constructs. Indicator loadings are reported in Online Resource 1 (Table S2 and Fig. S1). *** p &lt; 0.001, ** p &lt; 0.01, * p &lt; 0.05</w:t>
       </w:r>
     </w:p>
     <w:p>
@@ -7196,10 +7246,20 @@
       <w:r>
         <w:rPr>
           <w:rFonts w:ascii="Times New Roman" w:hAnsi="Times New Roman" w:cs="Times New Roman" w:eastAsia="Times New Roman"/>
+          <w:b/>
+          <w:bCs/>
           <w:sz w:val="20"/>
           <w:szCs w:val="20"/>
         </w:rPr>
-        <w:t xml:space="preserve">Table 5  Standardized path coefficients (β) under alternative specifications</w:t>
+        <w:t xml:space="preserve">Table 5</w:t>
+      </w:r>
+      <w:r>
+        <w:rPr>
+          <w:rFonts w:ascii="Times New Roman" w:hAnsi="Times New Roman" w:cs="Times New Roman" w:eastAsia="Times New Roman"/>
+          <w:sz w:val="20"/>
+          <w:szCs w:val="20"/>
+        </w:rPr>
+        <w:t xml:space="preserve">  Standardized path coefficients (β) under alternative specifications</w:t>
       </w:r>
     </w:p>
     <w:tbl>
@@ -9145,7 +9205,7 @@
           <w:sz w:val="18"/>
           <w:szCs w:val="18"/>
         </w:rPr>
-        <w:t xml:space="preserve">Note. *** p &lt; 0.001, ** p &lt; 0.01, * p &lt; 0.05, ns = not significant. DWLS = diagonally weighted least squares on Pearson covariances. </w:t>
+        <w:t xml:space="preserve">Note. *** p &lt; 0.001, ** p &lt; 0.01, * p &lt; 0.05, ns = not significant. CA = control activities; FM = financial management; ORG, LEG, PRO and POL = organizational, legal, professional and political accountability; ML = maximum likelihood; DWLS = diagonally weighted least squares on Pearson covariances. </w:t>
       </w:r>
       <w:r>
         <w:rPr>
@@ -9264,85 +9324,6 @@
           <w:szCs w:val="24"/>
         </w:rPr>
         <w:t xml:space="preserve">Several limitations apply. The design is cross-sectional, so the paths are associations and not demonstrated causal effects. Data come from one organization in one city, which limits generalization to different administrative cultures. All data are self-reported by staff from a single source and capture perceived accountability. A method factor with equal loadings was modest, but the unconstrained factor was degenerate, and controlling the method factor lowered all coefficients and made two paths non-significant, so the coefficients may be somewhat inflated (Podsakoff et al., 2003). The sample (N = 187) is modest relative to 37 indicators, the χ² test of exact fit was significant, and the financial management construct had an AVE marginally below 0.50. Finally, differences between the two predictors were not statistically significant. Future research could use longitudinal designs around specific financial reforms, multi-source or objective accountability indicators such as audit findings, larger multi-organization samples with adequate power to test differences between components, and cross-national comparisons.</w:t>
-      </w:r>
-    </w:p>
-    <w:p>
-      <w:pPr>
-        <w:keepNext/>
-        <w:spacing w:before="240" w:after="120" w:line="360" w:lineRule="auto"/>
-        <w:jc w:val="left"/>
-      </w:pPr>
-      <w:r>
-        <w:rPr>
-          <w:rFonts w:ascii="Times New Roman" w:hAnsi="Times New Roman" w:cs="Times New Roman" w:eastAsia="Times New Roman"/>
-          <w:b/>
-          <w:bCs/>
-          <w:sz w:val="24"/>
-          <w:szCs w:val="24"/>
-        </w:rPr>
-        <w:t xml:space="preserve">Declarations</w:t>
-      </w:r>
-    </w:p>
-    <w:p>
-      <w:pPr>
-        <w:spacing w:before="0" w:after="120" w:line="360" w:lineRule="auto"/>
-        <w:jc w:val="both"/>
-      </w:pPr>
-      <w:r>
-        <w:rPr>
-          <w:rFonts w:ascii="Times New Roman" w:hAnsi="Times New Roman" w:cs="Times New Roman" w:eastAsia="Times New Roman"/>
-          <w:b/>
-          <w:bCs/>
-          <w:sz w:val="24"/>
-          <w:szCs w:val="24"/>
-        </w:rPr>
-        <w:t xml:space="preserve">Ethical approval and informed consent</w:t>
-      </w:r>
-      <w:r>
-        <w:rPr>
-          <w:rFonts w:ascii="Times New Roman" w:hAnsi="Times New Roman" w:cs="Times New Roman" w:eastAsia="Times New Roman"/>
-          <w:sz w:val="24"/>
-          <w:szCs w:val="24"/>
-        </w:rPr>
-        <w:t xml:space="preserve"> Participation was voluntary and anonymous, no identifying information was collected, and submitting the questionnaire was taken as informed consent. The study involved no foreseeable risk beyond everyday professional activities.</w:t>
-      </w:r>
-    </w:p>
-    <w:p>
-      <w:pPr>
-        <w:spacing w:before="0" w:after="120" w:line="360" w:lineRule="auto"/>
-        <w:jc w:val="both"/>
-      </w:pPr>
-      <w:r>
-        <w:rPr>
-          <w:rFonts w:ascii="Times New Roman" w:hAnsi="Times New Roman" w:cs="Times New Roman" w:eastAsia="Times New Roman"/>
-          <w:b/>
-          <w:bCs/>
-          <w:sz w:val="24"/>
-          <w:szCs w:val="24"/>
-        </w:rPr>
-        <w:t xml:space="preserve">Data availability</w:t>
-      </w:r>
-      <w:r>
-        <w:rPr>
-          <w:rFonts w:ascii="Times New Roman" w:hAnsi="Times New Roman" w:cs="Times New Roman" w:eastAsia="Times New Roman"/>
-          <w:sz w:val="24"/>
-          <w:szCs w:val="24"/>
-        </w:rPr>
-        <w:t xml:space="preserve"> The questionnaire items are reported in Online Resource 1. The anonymized item-level data and the analysis code are available from the corresponding author on reasonable request.</w:t>
-      </w:r>
-    </w:p>
-    <w:p>
-      <w:pPr>
-        <w:spacing w:before="0" w:after="120" w:line="360" w:lineRule="auto"/>
-        <w:jc w:val="both"/>
-      </w:pPr>
-      <w:r>
-        <w:rPr>
-          <w:rFonts w:ascii="Times New Roman" w:hAnsi="Times New Roman" w:cs="Times New Roman" w:eastAsia="Times New Roman"/>
-          <w:sz w:val="24"/>
-          <w:szCs w:val="24"/>
-        </w:rPr>
-        <w:t xml:space="preserve">Funding, competing interests, author contributions and acknowledgments are given in the title page file.</w:t>
       </w:r>
     </w:p>
     <w:p>

</xml_diff>

<commit_message>
Fig. 1: full SEM diagram with indicators at journal lettering size
Co-Authored-By: Claude Sonnet 5.5 <noreply@anthropic.com>
Claude-Session: https://claude.ai/code/session_019tVoF28ak8howjL2gUeBpa
</commit_message>
<xml_diff>
--- a/submission_POR/1_Manuscript_anonymized.docx
+++ b/submission_POR/1_Manuscript_anonymized.docx
@@ -7134,7 +7134,7 @@
       <w:r>
         <w:drawing>
           <wp:inline xmlns:a="http://schemas.openxmlformats.org/drawingml/2006/main" xmlns:pic="http://schemas.openxmlformats.org/drawingml/2006/picture">
-            <wp:extent cx="5760000" cy="4304196"/>
+            <wp:extent cx="5940000" cy="6096363"/>
             <wp:docPr id="1" name="Picture 1"/>
             <wp:cNvGraphicFramePr>
               <a:graphicFrameLocks noChangeAspect="1"/>
@@ -7155,7 +7155,7 @@
                   <pic:spPr>
                     <a:xfrm>
                       <a:off x="0" y="0"/>
-                      <a:ext cx="5760000" cy="4304196"/>
+                      <a:ext cx="5940000" cy="6096363"/>
                     </a:xfrm>
                     <a:prstGeom prst="rect"/>
                   </pic:spPr>
@@ -7187,7 +7187,7 @@
           <w:sz w:val="20"/>
           <w:szCs w:val="20"/>
         </w:rPr>
-        <w:t xml:space="preserve"> Estimated structural model: standardized path coefficients (β), correlation (r) between the exogenous constructs and R² of the endogenous constructs. Indicator loadings are reported in Online Resource 1 (Table S2 and Fig. S1). *** p &lt; 0.001, ** p &lt; 0.01, * p &lt; 0.05</w:t>
+        <w:t xml:space="preserve"> Estimated structural equation model with standardized path coefficients (β), standardized indicator loadings, correlation (r) between the exogenous constructs and R² of the endogenous constructs. *** p &lt; 0.001, ** p &lt; 0.01, * p &lt; 0.05</w:t>
       </w:r>
     </w:p>
     <w:p>

</xml_diff>